<commit_message>
Refresh integration handoffs from validated source snapshots
</commit_message>
<xml_diff>
--- a/Website/static/downloads/integrations/events/EventIncidentBrief.docx
+++ b/Website/static/downloads/integrations/events/EventIncidentBrief.docx
@@ -41,6 +41,12 @@
       <w:pPr/>
       <w:r>
         <w:t xml:space="preserve">Use this snapshot to assign investigation. Event counts alone do not establish a root cause or service impact.</w:t>
+      </w:r>
+    </w:p>
+    <w:p>
+      <w:pPr/>
+      <w:r>
+        <w:t xml:space="preserve">2 named source computers / 2 named source logs. The register preserves each record's source where supplied.</w:t>
       </w:r>
     </w:p>
     <w:p>
@@ -445,7 +451,7 @@
         </w:numPr>
       </w:pPr>
       <w:r>
-        <w:t xml:space="preserve">Review timestamps and full messages in the attached event register.</w:t>
+        <w:t xml:space="preserve">Review source computers, logs, timestamps and full messages in the attached event register.</w:t>
       </w:r>
     </w:p>
     <w:p>
@@ -485,8 +491,8 @@
       </w:r>
     </w:p>
     <w:sectPr>
-      <w:headerReference w:type="default" r:id="Rc81aaf043a734fba"/>
-      <w:footerReference w:type="default" r:id="Re14083b2971b458c"/>
+      <w:headerReference w:type="default" r:id="R345c63584d404ca1"/>
+      <w:footerReference w:type="default" r:id="R7a5a53e2c98f4969"/>
       <w:pgSz w:w="12240" w:h="15840" w:code="1"/>
       <w:pgMar w:top="1440" w:right="1440" w:bottom="1440" w:left="1440" w:header="720" w:footer="720" w:gutter="0"/>
     </w:sectPr>
@@ -564,7 +570,7 @@
 <file path=word/numbering.xml><?xml version="1.0" encoding="utf-8"?>
 <w:numbering xmlns:wpc="http://schemas.microsoft.com/office/word/2010/wordprocessingCanvas" xmlns:cx="http://schemas.microsoft.com/office/drawing/2014/chartex" xmlns:cx1="http://schemas.microsoft.com/office/drawing/2015/9/8/chartex" xmlns:cx2="http://schemas.microsoft.com/office/drawing/2015/10/21/chartex" xmlns:cx3="http://schemas.microsoft.com/office/drawing/2016/5/9/chartex" xmlns:cx4="http://schemas.microsoft.com/office/drawing/2016/5/10/chartex" xmlns:cx5="http://schemas.microsoft.com/office/drawing/2016/5/11/chartex" xmlns:cx6="http://schemas.microsoft.com/office/drawing/2016/5/12/chartex" xmlns:cx7="http://schemas.microsoft.com/office/drawing/2016/5/13/chartex" xmlns:cx8="http://schemas.microsoft.com/office/drawing/2016/5/14/chartex" xmlns:mc="http://schemas.openxmlformats.org/markup-compatibility/2006" xmlns:aink="http://schemas.microsoft.com/office/drawing/2016/ink" xmlns:am3d="http://schemas.microsoft.com/office/drawing/2017/model3d" xmlns:o="urn:schemas-microsoft-com:office:office" xmlns:oel="http://schemas.microsoft.com/office/2019/extlst" xmlns:r="http://schemas.openxmlformats.org/officeDocument/2006/relationships" xmlns:m="http://schemas.openxmlformats.org/officeDocument/2006/math" xmlns:v="urn:schemas-microsoft-com:vml" xmlns:wp14="http://schemas.microsoft.com/office/word/2010/wordprocessingDrawing" xmlns:wp="http://schemas.openxmlformats.org/drawingml/2006/wordprocessingDrawing" xmlns:w10="urn:schemas-microsoft-com:office:word" xmlns:w="http://schemas.openxmlformats.org/wordprocessingml/2006/main" xmlns:w14="http://schemas.microsoft.com/office/word/2010/wordml" xmlns:w15="http://schemas.microsoft.com/office/word/2012/wordml" xmlns:w16cex="http://schemas.microsoft.com/office/word/2018/wordml/cex" xmlns:w16cid="http://schemas.microsoft.com/office/word/2016/wordml/cid" xmlns:w16="http://schemas.microsoft.com/office/word/2018/wordml" xmlns:w16sdtdh="http://schemas.microsoft.com/office/word/2020/wordml/sdtdatahash" xmlns:w16se="http://schemas.microsoft.com/office/word/2015/wordml/symex" xmlns:wpg="http://schemas.microsoft.com/office/word/2010/wordprocessingGroup" xmlns:wpi="http://schemas.microsoft.com/office/word/2010/wordprocessingInk" xmlns:wne="http://schemas.microsoft.com/office/word/2006/wordml" xmlns:wps="http://schemas.microsoft.com/office/word/2010/wordprocessingShape" mc:Ignorable="w14 w15 w16se w16cid w16 w16cex w16sdtdh wp14">
   <w:abstractNum w:abstractNumId="0" w15:restartNumberingAfterBreak="0">
-    <w:nsid w:val="FDF7B484"/>
+    <w:nsid w:val="04F868D1"/>
     <w:multiLevelType w:val="hybridMultilevel"/>
     <w:tmpl w:val="25BE4216"/>
     <w:lvl w:ilvl="0" w:tplc="0409000F">

</xml_diff>

<commit_message>
Pin integration downloads to strict-mode-safe event source
</commit_message>
<xml_diff>
--- a/Website/static/downloads/integrations/events/EventIncidentBrief.docx
+++ b/Website/static/downloads/integrations/events/EventIncidentBrief.docx
@@ -491,8 +491,8 @@
       </w:r>
     </w:p>
     <w:sectPr>
-      <w:headerReference w:type="default" r:id="R345c63584d404ca1"/>
-      <w:footerReference w:type="default" r:id="R7a5a53e2c98f4969"/>
+      <w:headerReference w:type="default" r:id="R6d5e9542160042df"/>
+      <w:footerReference w:type="default" r:id="R7f7cb02936304cd7"/>
       <w:pgSz w:w="12240" w:h="15840" w:code="1"/>
       <w:pgMar w:top="1440" w:right="1440" w:bottom="1440" w:left="1440" w:header="720" w:footer="720" w:gutter="0"/>
     </w:sectPr>
@@ -570,7 +570,7 @@
 <file path=word/numbering.xml><?xml version="1.0" encoding="utf-8"?>
 <w:numbering xmlns:wpc="http://schemas.microsoft.com/office/word/2010/wordprocessingCanvas" xmlns:cx="http://schemas.microsoft.com/office/drawing/2014/chartex" xmlns:cx1="http://schemas.microsoft.com/office/drawing/2015/9/8/chartex" xmlns:cx2="http://schemas.microsoft.com/office/drawing/2015/10/21/chartex" xmlns:cx3="http://schemas.microsoft.com/office/drawing/2016/5/9/chartex" xmlns:cx4="http://schemas.microsoft.com/office/drawing/2016/5/10/chartex" xmlns:cx5="http://schemas.microsoft.com/office/drawing/2016/5/11/chartex" xmlns:cx6="http://schemas.microsoft.com/office/drawing/2016/5/12/chartex" xmlns:cx7="http://schemas.microsoft.com/office/drawing/2016/5/13/chartex" xmlns:cx8="http://schemas.microsoft.com/office/drawing/2016/5/14/chartex" xmlns:mc="http://schemas.openxmlformats.org/markup-compatibility/2006" xmlns:aink="http://schemas.microsoft.com/office/drawing/2016/ink" xmlns:am3d="http://schemas.microsoft.com/office/drawing/2017/model3d" xmlns:o="urn:schemas-microsoft-com:office:office" xmlns:oel="http://schemas.microsoft.com/office/2019/extlst" xmlns:r="http://schemas.openxmlformats.org/officeDocument/2006/relationships" xmlns:m="http://schemas.openxmlformats.org/officeDocument/2006/math" xmlns:v="urn:schemas-microsoft-com:vml" xmlns:wp14="http://schemas.microsoft.com/office/word/2010/wordprocessingDrawing" xmlns:wp="http://schemas.openxmlformats.org/drawingml/2006/wordprocessingDrawing" xmlns:w10="urn:schemas-microsoft-com:office:word" xmlns:w="http://schemas.openxmlformats.org/wordprocessingml/2006/main" xmlns:w14="http://schemas.microsoft.com/office/word/2010/wordml" xmlns:w15="http://schemas.microsoft.com/office/word/2012/wordml" xmlns:w16cex="http://schemas.microsoft.com/office/word/2018/wordml/cex" xmlns:w16cid="http://schemas.microsoft.com/office/word/2016/wordml/cid" xmlns:w16="http://schemas.microsoft.com/office/word/2018/wordml" xmlns:w16sdtdh="http://schemas.microsoft.com/office/word/2020/wordml/sdtdatahash" xmlns:w16se="http://schemas.microsoft.com/office/word/2015/wordml/symex" xmlns:wpg="http://schemas.microsoft.com/office/word/2010/wordprocessingGroup" xmlns:wpi="http://schemas.microsoft.com/office/word/2010/wordprocessingInk" xmlns:wne="http://schemas.microsoft.com/office/word/2006/wordml" xmlns:wps="http://schemas.microsoft.com/office/word/2010/wordprocessingShape" mc:Ignorable="w14 w15 w16se w16cid w16 w16cex w16sdtdh wp14">
   <w:abstractNum w:abstractNumId="0" w15:restartNumberingAfterBreak="0">
-    <w:nsid w:val="04F868D1"/>
+    <w:nsid w:val="D647A5E4"/>
     <w:multiLevelType w:val="hybridMultilevel"/>
     <w:tmpl w:val="25BE4216"/>
     <w:lvl w:ilvl="0" w:tplc="0409000F">

</xml_diff>

<commit_message>
Refresh integration downloads with precise prices and timestamps
</commit_message>
<xml_diff>
--- a/Website/static/downloads/integrations/events/EventIncidentBrief.docx
+++ b/Website/static/downloads/integrations/events/EventIncidentBrief.docx
@@ -491,8 +491,8 @@
       </w:r>
     </w:p>
     <w:sectPr>
-      <w:headerReference w:type="default" r:id="R6d5e9542160042df"/>
-      <w:footerReference w:type="default" r:id="R7f7cb02936304cd7"/>
+      <w:headerReference w:type="default" r:id="R3fb16f2d1f234d16"/>
+      <w:footerReference w:type="default" r:id="R589751a9f4af40a5"/>
       <w:pgSz w:w="12240" w:h="15840" w:code="1"/>
       <w:pgMar w:top="1440" w:right="1440" w:bottom="1440" w:left="1440" w:header="720" w:footer="720" w:gutter="0"/>
     </w:sectPr>
@@ -570,7 +570,7 @@
 <file path=word/numbering.xml><?xml version="1.0" encoding="utf-8"?>
 <w:numbering xmlns:wpc="http://schemas.microsoft.com/office/word/2010/wordprocessingCanvas" xmlns:cx="http://schemas.microsoft.com/office/drawing/2014/chartex" xmlns:cx1="http://schemas.microsoft.com/office/drawing/2015/9/8/chartex" xmlns:cx2="http://schemas.microsoft.com/office/drawing/2015/10/21/chartex" xmlns:cx3="http://schemas.microsoft.com/office/drawing/2016/5/9/chartex" xmlns:cx4="http://schemas.microsoft.com/office/drawing/2016/5/10/chartex" xmlns:cx5="http://schemas.microsoft.com/office/drawing/2016/5/11/chartex" xmlns:cx6="http://schemas.microsoft.com/office/drawing/2016/5/12/chartex" xmlns:cx7="http://schemas.microsoft.com/office/drawing/2016/5/13/chartex" xmlns:cx8="http://schemas.microsoft.com/office/drawing/2016/5/14/chartex" xmlns:mc="http://schemas.openxmlformats.org/markup-compatibility/2006" xmlns:aink="http://schemas.microsoft.com/office/drawing/2016/ink" xmlns:am3d="http://schemas.microsoft.com/office/drawing/2017/model3d" xmlns:o="urn:schemas-microsoft-com:office:office" xmlns:oel="http://schemas.microsoft.com/office/2019/extlst" xmlns:r="http://schemas.openxmlformats.org/officeDocument/2006/relationships" xmlns:m="http://schemas.openxmlformats.org/officeDocument/2006/math" xmlns:v="urn:schemas-microsoft-com:vml" xmlns:wp14="http://schemas.microsoft.com/office/word/2010/wordprocessingDrawing" xmlns:wp="http://schemas.openxmlformats.org/drawingml/2006/wordprocessingDrawing" xmlns:w10="urn:schemas-microsoft-com:office:word" xmlns:w="http://schemas.openxmlformats.org/wordprocessingml/2006/main" xmlns:w14="http://schemas.microsoft.com/office/word/2010/wordml" xmlns:w15="http://schemas.microsoft.com/office/word/2012/wordml" xmlns:w16cex="http://schemas.microsoft.com/office/word/2018/wordml/cex" xmlns:w16cid="http://schemas.microsoft.com/office/word/2016/wordml/cid" xmlns:w16="http://schemas.microsoft.com/office/word/2018/wordml" xmlns:w16sdtdh="http://schemas.microsoft.com/office/word/2020/wordml/sdtdatahash" xmlns:w16se="http://schemas.microsoft.com/office/word/2015/wordml/symex" xmlns:wpg="http://schemas.microsoft.com/office/word/2010/wordprocessingGroup" xmlns:wpi="http://schemas.microsoft.com/office/word/2010/wordprocessingInk" xmlns:wne="http://schemas.microsoft.com/office/word/2006/wordml" xmlns:wps="http://schemas.microsoft.com/office/word/2010/wordprocessingShape" mc:Ignorable="w14 w15 w16se w16cid w16 w16cex w16sdtdh wp14">
   <w:abstractNum w:abstractNumId="0" w15:restartNumberingAfterBreak="0">
-    <w:nsid w:val="D647A5E4"/>
+    <w:nsid w:val="14636513"/>
     <w:multiLevelType w:val="hybridMultilevel"/>
     <w:tmpl w:val="25BE4216"/>
     <w:lvl w:ilvl="0" w:tplc="0409000F">

</xml_diff>

<commit_message>
Explain reporting workflows through embedded PowerShell articles
</commit_message>
<xml_diff>
--- a/Website/static/downloads/integrations/events/EventIncidentBrief.docx
+++ b/Website/static/downloads/integrations/events/EventIncidentBrief.docx
@@ -14,13 +14,13 @@
           <w:color w:val="17365D"/>
           <w:sz w:val="52"/>
         </w:rPr>
-        <w:t xml:space="preserve">Event incident brief</w:t>
+        <w:t xml:space="preserve">Windows event review</w:t>
       </w:r>
     </w:p>
     <w:p>
       <w:pPr/>
       <w:r>
-        <w:t xml:space="preserve">Synthetic incident exercise / 11 October 2026</w:t>
+        <w:t xml:space="preserve">Application log | last 24 hours | levels 1, 2, 3 | limit 100 | collected 2026-10-11 06:30:00 +02:00</w:t>
       </w:r>
     </w:p>
     <w:p>
@@ -32,21 +32,15 @@
           <w:b/>
           <w:bCs/>
           <w:color w:val="9A3412"/>
-          <w:sz w:val="36"/>
+          <w:sz w:val="32"/>
         </w:rPr>
-        <w:t xml:space="preserve">4 retained records</w:t>
+        <w:t xml:space="preserve">4 retained / 0 critical / 2 errors / 2 warnings</w:t>
       </w:r>
     </w:p>
     <w:p>
       <w:pPr/>
       <w:r>
-        <w:t xml:space="preserve">Use this snapshot to assign investigation. Event counts alone do not establish a root cause or service impact.</w:t>
-      </w:r>
-    </w:p>
-    <w:p>
-      <w:pPr/>
-      <w:r>
-        <w:t xml:space="preserve">2 named source computers / 2 named source logs. The register preserves each record's source where supplied.</w:t>
+        <w:t xml:space="preserve">This bounded snapshot supports investigation. Counts do not identify a root cause or describe the entire environment.</w:t>
       </w:r>
     </w:p>
     <w:p>
@@ -61,7 +55,7 @@
           <w:color w:val="17365D"/>
           <w:sz w:val="30"/>
         </w:rPr>
-        <w:t xml:space="preserve">Most represented providers</w:t>
+        <w:t xml:space="preserve">Where to start looking</w:t>
       </w:r>
     </w:p>
     <w:tbl>
@@ -72,21 +66,16 @@
         <w:tblLook w:val="04A0"/>
       </w:tblPr>
       <w:tblGrid>
-        <w:gridCol w:w="1872"/>
-        <w:gridCol w:w="1872"/>
-        <w:gridCol w:w="1872"/>
-        <w:gridCol w:w="1872"/>
-        <w:gridCol w:w="1872"/>
+        <w:gridCol w:w="4680"/>
+        <w:gridCol w:w="4680"/>
       </w:tblGrid>
       <w:tr>
         <w:tc>
           <w:tcPr>
-            <w:tcW w:w="1000" w:type="pct"/>
+            <w:tcW w:w="2500" w:type="pct"/>
             <w:tcMar>
               <w:top w:w="79" w:type="dxa"/>
-              <w:left w:w="91" w:type="dxa"/>
               <w:bottom w:w="79" w:type="dxa"/>
-              <w:right w:w="91" w:type="dxa"/>
             </w:tcMar>
           </w:tcPr>
           <w:p>
@@ -98,69 +87,16 @@
         </w:tc>
         <w:tc>
           <w:tcPr>
-            <w:tcW w:w="1000" w:type="pct"/>
+            <w:tcW w:w="2500" w:type="pct"/>
             <w:tcMar>
               <w:top w:w="79" w:type="dxa"/>
-              <w:left w:w="91" w:type="dxa"/>
               <w:bottom w:w="79" w:type="dxa"/>
-              <w:right w:w="91" w:type="dxa"/>
             </w:tcMar>
           </w:tcPr>
           <w:p>
             <w:pPr/>
             <w:r>
-              <w:t xml:space="preserve">Records</w:t>
-            </w:r>
-          </w:p>
-        </w:tc>
-        <w:tc>
-          <w:tcPr>
-            <w:tcW w:w="1000" w:type="pct"/>
-            <w:tcMar>
-              <w:top w:w="79" w:type="dxa"/>
-              <w:left w:w="91" w:type="dxa"/>
-              <w:bottom w:w="79" w:type="dxa"/>
-              <w:right w:w="91" w:type="dxa"/>
-            </w:tcMar>
-          </w:tcPr>
-          <w:p>
-            <w:pPr/>
-            <w:r>
-              <w:t xml:space="preserve">Critical</w:t>
-            </w:r>
-          </w:p>
-        </w:tc>
-        <w:tc>
-          <w:tcPr>
-            <w:tcW w:w="1000" w:type="pct"/>
-            <w:tcMar>
-              <w:top w:w="79" w:type="dxa"/>
-              <w:left w:w="91" w:type="dxa"/>
-              <w:bottom w:w="79" w:type="dxa"/>
-              <w:right w:w="91" w:type="dxa"/>
-            </w:tcMar>
-          </w:tcPr>
-          <w:p>
-            <w:pPr/>
-            <w:r>
-              <w:t xml:space="preserve">Errors</w:t>
-            </w:r>
-          </w:p>
-        </w:tc>
-        <w:tc>
-          <w:tcPr>
-            <w:tcW w:w="1000" w:type="pct"/>
-            <w:tcMar>
-              <w:top w:w="79" w:type="dxa"/>
-              <w:left w:w="91" w:type="dxa"/>
-              <w:bottom w:w="79" w:type="dxa"/>
-              <w:right w:w="91" w:type="dxa"/>
-            </w:tcMar>
-          </w:tcPr>
-          <w:p>
-            <w:pPr/>
-            <w:r>
-              <w:t xml:space="preserve">Warnings</w:t>
+              <w:t xml:space="preserve">Events</w:t>
             </w:r>
           </w:p>
         </w:tc>
@@ -168,12 +104,10 @@
       <w:tr>
         <w:tc>
           <w:tcPr>
-            <w:tcW w:w="1000" w:type="pct"/>
+            <w:tcW w:w="2500" w:type="pct"/>
             <w:tcMar>
               <w:top w:w="79" w:type="dxa"/>
-              <w:left w:w="91" w:type="dxa"/>
               <w:bottom w:w="79" w:type="dxa"/>
-              <w:right w:w="91" w:type="dxa"/>
             </w:tcMar>
           </w:tcPr>
           <w:p>
@@ -185,12 +119,10 @@
         </w:tc>
         <w:tc>
           <w:tcPr>
-            <w:tcW w:w="1000" w:type="pct"/>
+            <w:tcW w:w="2500" w:type="pct"/>
             <w:tcMar>
               <w:top w:w="79" w:type="dxa"/>
-              <w:left w:w="91" w:type="dxa"/>
               <w:bottom w:w="79" w:type="dxa"/>
-              <w:right w:w="91" w:type="dxa"/>
             </w:tcMar>
           </w:tcPr>
           <w:p>
@@ -200,135 +132,29 @@
             </w:r>
           </w:p>
         </w:tc>
+      </w:tr>
+      <w:tr>
         <w:tc>
           <w:tcPr>
-            <w:tcW w:w="1000" w:type="pct"/>
+            <w:tcW w:w="2500" w:type="pct"/>
             <w:tcMar>
               <w:top w:w="79" w:type="dxa"/>
-              <w:left w:w="91" w:type="dxa"/>
               <w:bottom w:w="79" w:type="dxa"/>
-              <w:right w:w="91" w:type="dxa"/>
             </w:tcMar>
           </w:tcPr>
           <w:p>
             <w:pPr/>
             <w:r>
-              <w:t xml:space="preserve">0</w:t>
+              <w:t xml:space="preserve">Demo.Service</w:t>
             </w:r>
           </w:p>
         </w:tc>
         <w:tc>
           <w:tcPr>
-            <w:tcW w:w="1000" w:type="pct"/>
+            <w:tcW w:w="2500" w:type="pct"/>
             <w:tcMar>
               <w:top w:w="79" w:type="dxa"/>
-              <w:left w:w="91" w:type="dxa"/>
               <w:bottom w:w="79" w:type="dxa"/>
-              <w:right w:w="91" w:type="dxa"/>
-            </w:tcMar>
-          </w:tcPr>
-          <w:p>
-            <w:pPr/>
-            <w:r>
-              <w:t xml:space="preserve">2</w:t>
-            </w:r>
-          </w:p>
-        </w:tc>
-        <w:tc>
-          <w:tcPr>
-            <w:tcW w:w="1000" w:type="pct"/>
-            <w:tcMar>
-              <w:top w:w="79" w:type="dxa"/>
-              <w:left w:w="91" w:type="dxa"/>
-              <w:bottom w:w="79" w:type="dxa"/>
-              <w:right w:w="91" w:type="dxa"/>
-            </w:tcMar>
-          </w:tcPr>
-          <w:p>
-            <w:pPr/>
-            <w:r>
-              <w:t xml:space="preserve">0</w:t>
-            </w:r>
-          </w:p>
-        </w:tc>
-      </w:tr>
-      <w:tr>
-        <w:tc>
-          <w:tcPr>
-            <w:tcW w:w="1000" w:type="pct"/>
-            <w:tcMar>
-              <w:top w:w="79" w:type="dxa"/>
-              <w:left w:w="91" w:type="dxa"/>
-              <w:bottom w:w="79" w:type="dxa"/>
-              <w:right w:w="91" w:type="dxa"/>
-            </w:tcMar>
-          </w:tcPr>
-          <w:p>
-            <w:pPr/>
-            <w:r>
-              <w:t xml:space="preserve">Demo.Inventory</w:t>
-            </w:r>
-          </w:p>
-        </w:tc>
-        <w:tc>
-          <w:tcPr>
-            <w:tcW w:w="1000" w:type="pct"/>
-            <w:tcMar>
-              <w:top w:w="79" w:type="dxa"/>
-              <w:left w:w="91" w:type="dxa"/>
-              <w:bottom w:w="79" w:type="dxa"/>
-              <w:right w:w="91" w:type="dxa"/>
-            </w:tcMar>
-          </w:tcPr>
-          <w:p>
-            <w:pPr/>
-            <w:r>
-              <w:t xml:space="preserve">1</w:t>
-            </w:r>
-          </w:p>
-        </w:tc>
-        <w:tc>
-          <w:tcPr>
-            <w:tcW w:w="1000" w:type="pct"/>
-            <w:tcMar>
-              <w:top w:w="79" w:type="dxa"/>
-              <w:left w:w="91" w:type="dxa"/>
-              <w:bottom w:w="79" w:type="dxa"/>
-              <w:right w:w="91" w:type="dxa"/>
-            </w:tcMar>
-          </w:tcPr>
-          <w:p>
-            <w:pPr/>
-            <w:r>
-              <w:t xml:space="preserve">0</w:t>
-            </w:r>
-          </w:p>
-        </w:tc>
-        <w:tc>
-          <w:tcPr>
-            <w:tcW w:w="1000" w:type="pct"/>
-            <w:tcMar>
-              <w:top w:w="79" w:type="dxa"/>
-              <w:left w:w="91" w:type="dxa"/>
-              <w:bottom w:w="79" w:type="dxa"/>
-              <w:right w:w="91" w:type="dxa"/>
-            </w:tcMar>
-          </w:tcPr>
-          <w:p>
-            <w:pPr/>
-            <w:r>
-              <w:t xml:space="preserve">0</w:t>
-            </w:r>
-          </w:p>
-        </w:tc>
-        <w:tc>
-          <w:tcPr>
-            <w:tcW w:w="1000" w:type="pct"/>
-            <w:tcMar>
-              <w:top w:w="79" w:type="dxa"/>
-              <w:left w:w="91" w:type="dxa"/>
-              <w:bottom w:w="79" w:type="dxa"/>
-              <w:right w:w="91" w:type="dxa"/>
             </w:tcMar>
           </w:tcPr>
           <w:p>
@@ -342,80 +168,25 @@
       <w:tr>
         <w:tc>
           <w:tcPr>
-            <w:tcW w:w="1000" w:type="pct"/>
+            <w:tcW w:w="2500" w:type="pct"/>
             <w:tcMar>
               <w:top w:w="79" w:type="dxa"/>
-              <w:left w:w="91" w:type="dxa"/>
               <w:bottom w:w="79" w:type="dxa"/>
-              <w:right w:w="91" w:type="dxa"/>
             </w:tcMar>
           </w:tcPr>
           <w:p>
             <w:pPr/>
             <w:r>
-              <w:t xml:space="preserve">Demo.Sync</w:t>
+              <w:t xml:space="preserve">Demo.Storage</w:t>
             </w:r>
           </w:p>
         </w:tc>
         <w:tc>
           <w:tcPr>
-            <w:tcW w:w="1000" w:type="pct"/>
+            <w:tcW w:w="2500" w:type="pct"/>
             <w:tcMar>
               <w:top w:w="79" w:type="dxa"/>
-              <w:left w:w="91" w:type="dxa"/>
               <w:bottom w:w="79" w:type="dxa"/>
-              <w:right w:w="91" w:type="dxa"/>
-            </w:tcMar>
-          </w:tcPr>
-          <w:p>
-            <w:pPr/>
-            <w:r>
-              <w:t xml:space="preserve">1</w:t>
-            </w:r>
-          </w:p>
-        </w:tc>
-        <w:tc>
-          <w:tcPr>
-            <w:tcW w:w="1000" w:type="pct"/>
-            <w:tcMar>
-              <w:top w:w="79" w:type="dxa"/>
-              <w:left w:w="91" w:type="dxa"/>
-              <w:bottom w:w="79" w:type="dxa"/>
-              <w:right w:w="91" w:type="dxa"/>
-            </w:tcMar>
-          </w:tcPr>
-          <w:p>
-            <w:pPr/>
-            <w:r>
-              <w:t xml:space="preserve">0</w:t>
-            </w:r>
-          </w:p>
-        </w:tc>
-        <w:tc>
-          <w:tcPr>
-            <w:tcW w:w="1000" w:type="pct"/>
-            <w:tcMar>
-              <w:top w:w="79" w:type="dxa"/>
-              <w:left w:w="91" w:type="dxa"/>
-              <w:bottom w:w="79" w:type="dxa"/>
-              <w:right w:w="91" w:type="dxa"/>
-            </w:tcMar>
-          </w:tcPr>
-          <w:p>
-            <w:pPr/>
-            <w:r>
-              <w:t xml:space="preserve">0</w:t>
-            </w:r>
-          </w:p>
-        </w:tc>
-        <w:tc>
-          <w:tcPr>
-            <w:tcW w:w="1000" w:type="pct"/>
-            <w:tcMar>
-              <w:top w:w="79" w:type="dxa"/>
-              <w:left w:w="91" w:type="dxa"/>
-              <w:bottom w:w="79" w:type="dxa"/>
-              <w:right w:w="91" w:type="dxa"/>
             </w:tcMar>
           </w:tcPr>
           <w:p>
@@ -451,7 +222,7 @@
         </w:numPr>
       </w:pPr>
       <w:r>
-        <w:t xml:space="preserve">Review source computers, logs, timestamps and full messages in the attached event register.</w:t>
+        <w:t xml:space="preserve">Open EventRegister.xlsx and read the full messages for the busiest providers.</w:t>
       </w:r>
     </w:p>
     <w:p>
@@ -463,7 +234,7 @@
         </w:numPr>
       </w:pPr>
       <w:r>
-        <w:t xml:space="preserve">Confirm user impact and correlate the events with recent changes.</w:t>
+        <w:t xml:space="preserve">Compare the timestamps with the failed job, service change or user report.</w:t>
       </w:r>
     </w:p>
     <w:p>
@@ -475,24 +246,12 @@
         </w:numPr>
       </w:pPr>
       <w:r>
-        <w:t xml:space="preserve">Assign an owner, record the findings and agree a follow-up time.</w:t>
-      </w:r>
-    </w:p>
-    <w:p>
-      <w:pPr>
-        <w:spacing w:before="240"/>
-      </w:pPr>
-      <w:r>
-        <w:rPr>
-          <w:color w:val="475569"/>
-          <w:sz w:val="20"/>
-        </w:rPr>
-        <w:t xml:space="preserve">Only the top eight providers appear here. The workbook retains every record in this bounded snapshot. Review event messages before sharing them.</w:t>
+        <w:t xml:space="preserve">Record the investigation owner, next action and follow-up time in this document.</w:t>
       </w:r>
     </w:p>
     <w:sectPr>
-      <w:headerReference w:type="default" r:id="R3fb16f2d1f234d16"/>
-      <w:footerReference w:type="default" r:id="R589751a9f4af40a5"/>
+      <w:headerReference w:type="default" r:id="R0c4bec2926174b55"/>
+      <w:footerReference w:type="default" r:id="R8c19e0078a6543ad"/>
       <w:pgSz w:w="12240" w:h="15840" w:code="1"/>
       <w:pgMar w:top="1440" w:right="1440" w:bottom="1440" w:left="1440" w:header="720" w:footer="720" w:gutter="0"/>
     </w:sectPr>
@@ -570,89 +329,116 @@
 <file path=word/numbering.xml><?xml version="1.0" encoding="utf-8"?>
 <w:numbering xmlns:wpc="http://schemas.microsoft.com/office/word/2010/wordprocessingCanvas" xmlns:cx="http://schemas.microsoft.com/office/drawing/2014/chartex" xmlns:cx1="http://schemas.microsoft.com/office/drawing/2015/9/8/chartex" xmlns:cx2="http://schemas.microsoft.com/office/drawing/2015/10/21/chartex" xmlns:cx3="http://schemas.microsoft.com/office/drawing/2016/5/9/chartex" xmlns:cx4="http://schemas.microsoft.com/office/drawing/2016/5/10/chartex" xmlns:cx5="http://schemas.microsoft.com/office/drawing/2016/5/11/chartex" xmlns:cx6="http://schemas.microsoft.com/office/drawing/2016/5/12/chartex" xmlns:cx7="http://schemas.microsoft.com/office/drawing/2016/5/13/chartex" xmlns:cx8="http://schemas.microsoft.com/office/drawing/2016/5/14/chartex" xmlns:mc="http://schemas.openxmlformats.org/markup-compatibility/2006" xmlns:aink="http://schemas.microsoft.com/office/drawing/2016/ink" xmlns:am3d="http://schemas.microsoft.com/office/drawing/2017/model3d" xmlns:o="urn:schemas-microsoft-com:office:office" xmlns:oel="http://schemas.microsoft.com/office/2019/extlst" xmlns:r="http://schemas.openxmlformats.org/officeDocument/2006/relationships" xmlns:m="http://schemas.openxmlformats.org/officeDocument/2006/math" xmlns:v="urn:schemas-microsoft-com:vml" xmlns:wp14="http://schemas.microsoft.com/office/word/2010/wordprocessingDrawing" xmlns:wp="http://schemas.openxmlformats.org/drawingml/2006/wordprocessingDrawing" xmlns:w10="urn:schemas-microsoft-com:office:word" xmlns:w="http://schemas.openxmlformats.org/wordprocessingml/2006/main" xmlns:w14="http://schemas.microsoft.com/office/word/2010/wordml" xmlns:w15="http://schemas.microsoft.com/office/word/2012/wordml" xmlns:w16cex="http://schemas.microsoft.com/office/word/2018/wordml/cex" xmlns:w16cid="http://schemas.microsoft.com/office/word/2016/wordml/cid" xmlns:w16="http://schemas.microsoft.com/office/word/2018/wordml" xmlns:w16sdtdh="http://schemas.microsoft.com/office/word/2020/wordml/sdtdatahash" xmlns:w16se="http://schemas.microsoft.com/office/word/2015/wordml/symex" xmlns:wpg="http://schemas.microsoft.com/office/word/2010/wordprocessingGroup" xmlns:wpi="http://schemas.microsoft.com/office/word/2010/wordprocessingInk" xmlns:wne="http://schemas.microsoft.com/office/word/2006/wordml" xmlns:wps="http://schemas.microsoft.com/office/word/2010/wordprocessingShape" mc:Ignorable="w14 w15 w16se w16cid w16 w16cex w16sdtdh wp14">
   <w:abstractNum w:abstractNumId="0" w15:restartNumberingAfterBreak="0">
-    <w:nsid w:val="14636513"/>
+    <w:nsid w:val="B7A1AAB7"/>
     <w:multiLevelType w:val="hybridMultilevel"/>
-    <w:tmpl w:val="25BE4216"/>
-    <w:lvl w:ilvl="0" w:tplc="0409000F">
+    <w:tmpl w:val="934E79A6"/>
+    <w:lvl w:ilvl="0" w:tplc="04090001">
       <w:start w:val="1"/>
-      <w:numFmt w:val="decimal"/>
-      <w:lvlText w:val="%1."/>
+      <w:numFmt w:val="bullet"/>
+      <w:lvlText w:val="·"/>
       <w:lvlJc w:val="left"/>
       <w:pPr>
         <w:ind w:left="720" w:hanging="360"/>
       </w:pPr>
+      <w:rPr>
+        <w:rFonts w:hint="default" w:ascii="Symbol" w:hAnsi="Symbol"/>
+      </w:rPr>
     </w:lvl>
-    <w:lvl w:ilvl="1" w:tplc="04090019" w:tentative="true">
+    <w:lvl w:ilvl="1" w:tplc="04090003">
       <w:start w:val="1"/>
-      <w:numFmt w:val="lowerLetter"/>
-      <w:lvlText w:val="%2."/>
+      <w:numFmt w:val="bullet"/>
+      <w:lvlText w:val="o"/>
       <w:lvlJc w:val="left"/>
       <w:pPr>
         <w:ind w:left="1440" w:hanging="360"/>
       </w:pPr>
+      <w:rPr>
+        <w:rFonts w:hint="default" w:ascii="Courier New" w:hAnsi="Courier New" w:cs="Courier New"/>
+      </w:rPr>
     </w:lvl>
-    <w:lvl w:ilvl="2" w:tplc="0409001B" w:tentative="true">
+    <w:lvl w:ilvl="2" w:tplc="04090005" w:tentative="true">
       <w:start w:val="1"/>
-      <w:numFmt w:val="lowerRoman"/>
-      <w:lvlText w:val="%3."/>
+      <w:numFmt w:val="bullet"/>
+      <w:lvlText w:val="§"/>
       <w:lvlJc w:val="left"/>
       <w:pPr>
-        <w:ind w:left="2160" w:hanging="180"/>
+        <w:ind w:left="2160" w:hanging="360"/>
       </w:pPr>
+      <w:rPr>
+        <w:rFonts w:hint="default" w:ascii="Wingdings" w:hAnsi="Wingdings"/>
+      </w:rPr>
     </w:lvl>
-    <w:lvl w:ilvl="3" w:tplc="0409000F" w:tentative="true">
+    <w:lvl w:ilvl="3" w:tplc="04090001" w:tentative="true">
       <w:start w:val="1"/>
-      <w:numFmt w:val="decimal"/>
-      <w:lvlText w:val="%4."/>
+      <w:numFmt w:val="bullet"/>
+      <w:lvlText w:val="·"/>
       <w:lvlJc w:val="left"/>
       <w:pPr>
         <w:ind w:left="2880" w:hanging="360"/>
       </w:pPr>
+      <w:rPr>
+        <w:rFonts w:hint="default" w:ascii="Symbol" w:hAnsi="Symbol"/>
+      </w:rPr>
     </w:lvl>
-    <w:lvl w:ilvl="4" w:tplc="04090019" w:tentative="true">
+    <w:lvl w:ilvl="4" w:tplc="04090003" w:tentative="true">
       <w:start w:val="1"/>
-      <w:numFmt w:val="lowerLetter"/>
-      <w:lvlText w:val="%5."/>
+      <w:numFmt w:val="bullet"/>
+      <w:lvlText w:val="o"/>
       <w:lvlJc w:val="left"/>
       <w:pPr>
         <w:ind w:left="3600" w:hanging="360"/>
       </w:pPr>
+      <w:rPr>
+        <w:rFonts w:hint="default" w:ascii="Courier New" w:hAnsi="Courier New" w:cs="Courier New"/>
+      </w:rPr>
     </w:lvl>
-    <w:lvl w:ilvl="5" w:tplc="0409001B" w:tentative="true">
+    <w:lvl w:ilvl="5" w:tplc="04090005" w:tentative="true">
       <w:start w:val="1"/>
-      <w:numFmt w:val="lowerRoman"/>
-      <w:lvlText w:val="%6."/>
+      <w:numFmt w:val="bullet"/>
+      <w:lvlText w:val="§"/>
       <w:lvlJc w:val="left"/>
       <w:pPr>
-        <w:ind w:left="4320" w:hanging="180"/>
+        <w:ind w:left="4320" w:hanging="360"/>
       </w:pPr>
+      <w:rPr>
+        <w:rFonts w:hint="default" w:ascii="Wingdings" w:hAnsi="Wingdings"/>
+      </w:rPr>
     </w:lvl>
-    <w:lvl w:ilvl="6" w:tplc="0409000F" w:tentative="true">
+    <w:lvl w:ilvl="6" w:tplc="04090001" w:tentative="true">
       <w:start w:val="1"/>
-      <w:numFmt w:val="decimal"/>
-      <w:lvlText w:val="%7."/>
+      <w:numFmt w:val="bullet"/>
+      <w:lvlText w:val="·"/>
       <w:lvlJc w:val="left"/>
       <w:pPr>
         <w:ind w:left="5040" w:hanging="360"/>
       </w:pPr>
+      <w:rPr>
+        <w:rFonts w:hint="default" w:ascii="Symbol" w:hAnsi="Symbol"/>
+      </w:rPr>
     </w:lvl>
-    <w:lvl w:ilvl="7" w:tplc="04090019" w:tentative="true">
+    <w:lvl w:ilvl="7" w:tplc="04090003" w:tentative="true">
       <w:start w:val="1"/>
-      <w:numFmt w:val="lowerLetter"/>
-      <w:lvlText w:val="%8."/>
+      <w:numFmt w:val="bullet"/>
+      <w:lvlText w:val="o"/>
       <w:lvlJc w:val="left"/>
       <w:pPr>
         <w:ind w:left="5760" w:hanging="360"/>
       </w:pPr>
+      <w:rPr>
+        <w:rFonts w:hint="default" w:ascii="Courier New" w:hAnsi="Courier New" w:cs="Courier New"/>
+      </w:rPr>
     </w:lvl>
-    <w:lvl w:ilvl="8" w:tplc="0409001B" w:tentative="true">
+    <w:lvl w:ilvl="8" w:tplc="04090005" w:tentative="true">
       <w:start w:val="1"/>
-      <w:numFmt w:val="lowerRoman"/>
-      <w:lvlText w:val="%9."/>
+      <w:numFmt w:val="bullet"/>
+      <w:lvlText w:val="§"/>
       <w:lvlJc w:val="left"/>
       <w:pPr>
-        <w:ind w:left="6480" w:hanging="180"/>
+        <w:ind w:left="6480" w:hanging="360"/>
       </w:pPr>
+      <w:rPr>
+        <w:rFonts w:hint="default" w:ascii="Wingdings" w:hAnsi="Wingdings"/>
+      </w:rPr>
     </w:lvl>
   </w:abstractNum>
   <w:num w:numId="1">

</xml_diff>

<commit_message>
Regenerate integration downloads with the current commands
</commit_message>
<xml_diff>
--- a/Website/static/downloads/integrations/events/EventIncidentBrief.docx
+++ b/Website/static/downloads/integrations/events/EventIncidentBrief.docx
@@ -9,8 +9,8 @@
       </w:pPr>
       <w:r>
         <w:rPr>
-          <w:b/>
-          <w:bCs/>
+          <w:b w:val="true"/>
+          <w:bCs w:val="true"/>
           <w:color w:val="17365D"/>
           <w:sz w:val="52"/>
         </w:rPr>
@@ -29,8 +29,8 @@
       </w:pPr>
       <w:r>
         <w:rPr>
-          <w:b/>
-          <w:bCs/>
+          <w:b w:val="true"/>
+          <w:bCs w:val="true"/>
           <w:color w:val="9A3412"/>
           <w:sz w:val="32"/>
         </w:rPr>
@@ -50,8 +50,8 @@
       </w:pPr>
       <w:r>
         <w:rPr>
-          <w:b/>
-          <w:bCs/>
+          <w:b w:val="true"/>
+          <w:bCs w:val="true"/>
           <w:color w:val="17365D"/>
           <w:sz w:val="30"/>
         </w:rPr>
@@ -205,8 +205,8 @@
       </w:pPr>
       <w:r>
         <w:rPr>
-          <w:b/>
-          <w:bCs/>
+          <w:b w:val="true"/>
+          <w:bCs w:val="true"/>
           <w:color w:val="17365D"/>
           <w:sz w:val="30"/>
         </w:rPr>
@@ -250,8 +250,8 @@
       </w:r>
     </w:p>
     <w:sectPr>
-      <w:headerReference w:type="default" r:id="R0c4bec2926174b55"/>
-      <w:footerReference w:type="default" r:id="R8c19e0078a6543ad"/>
+      <w:headerReference w:type="default" r:id="R2cf2818327594322"/>
+      <w:footerReference w:type="default" r:id="Ra01970b5c9f64920"/>
       <w:pgSz w:w="12240" w:h="15840" w:code="1"/>
       <w:pgMar w:top="1440" w:right="1440" w:bottom="1440" w:left="1440" w:header="720" w:footer="720" w:gutter="0"/>
     </w:sectPr>
@@ -267,6 +267,7 @@
 <w:ftr xmlns:w="http://schemas.openxmlformats.org/wordprocessingml/2006/main">
   <w:p>
     <w:pPr/>
+    <w:r/>
     <w:fldSimple w:instr=" PAGE  \* MERGEFORMAT " w:dirty="true">
       <w:r>
         <w:rPr>
@@ -276,6 +277,7 @@
       </w:r>
     </w:fldSimple>
     <w:r>
+      <w:rPr/>
       <w:t xml:space="preserve"> of </w:t>
     </w:r>
     <w:fldSimple w:instr=" NUMPAGES  \* MERGEFORMAT " w:dirty="true">
@@ -329,7 +331,7 @@
 <file path=word/numbering.xml><?xml version="1.0" encoding="utf-8"?>
 <w:numbering xmlns:wpc="http://schemas.microsoft.com/office/word/2010/wordprocessingCanvas" xmlns:cx="http://schemas.microsoft.com/office/drawing/2014/chartex" xmlns:cx1="http://schemas.microsoft.com/office/drawing/2015/9/8/chartex" xmlns:cx2="http://schemas.microsoft.com/office/drawing/2015/10/21/chartex" xmlns:cx3="http://schemas.microsoft.com/office/drawing/2016/5/9/chartex" xmlns:cx4="http://schemas.microsoft.com/office/drawing/2016/5/10/chartex" xmlns:cx5="http://schemas.microsoft.com/office/drawing/2016/5/11/chartex" xmlns:cx6="http://schemas.microsoft.com/office/drawing/2016/5/12/chartex" xmlns:cx7="http://schemas.microsoft.com/office/drawing/2016/5/13/chartex" xmlns:cx8="http://schemas.microsoft.com/office/drawing/2016/5/14/chartex" xmlns:mc="http://schemas.openxmlformats.org/markup-compatibility/2006" xmlns:aink="http://schemas.microsoft.com/office/drawing/2016/ink" xmlns:am3d="http://schemas.microsoft.com/office/drawing/2017/model3d" xmlns:o="urn:schemas-microsoft-com:office:office" xmlns:oel="http://schemas.microsoft.com/office/2019/extlst" xmlns:r="http://schemas.openxmlformats.org/officeDocument/2006/relationships" xmlns:m="http://schemas.openxmlformats.org/officeDocument/2006/math" xmlns:v="urn:schemas-microsoft-com:vml" xmlns:wp14="http://schemas.microsoft.com/office/word/2010/wordprocessingDrawing" xmlns:wp="http://schemas.openxmlformats.org/drawingml/2006/wordprocessingDrawing" xmlns:w10="urn:schemas-microsoft-com:office:word" xmlns:w="http://schemas.openxmlformats.org/wordprocessingml/2006/main" xmlns:w14="http://schemas.microsoft.com/office/word/2010/wordml" xmlns:w15="http://schemas.microsoft.com/office/word/2012/wordml" xmlns:w16cex="http://schemas.microsoft.com/office/word/2018/wordml/cex" xmlns:w16cid="http://schemas.microsoft.com/office/word/2016/wordml/cid" xmlns:w16="http://schemas.microsoft.com/office/word/2018/wordml" xmlns:w16sdtdh="http://schemas.microsoft.com/office/word/2020/wordml/sdtdatahash" xmlns:w16se="http://schemas.microsoft.com/office/word/2015/wordml/symex" xmlns:wpg="http://schemas.microsoft.com/office/word/2010/wordprocessingGroup" xmlns:wpi="http://schemas.microsoft.com/office/word/2010/wordprocessingInk" xmlns:wne="http://schemas.microsoft.com/office/word/2006/wordml" xmlns:wps="http://schemas.microsoft.com/office/word/2010/wordprocessingShape" mc:Ignorable="w14 w15 w16se w16cid w16 w16cex w16sdtdh wp14">
   <w:abstractNum w:abstractNumId="0" w15:restartNumberingAfterBreak="0">
-    <w:nsid w:val="B7A1AAB7"/>
+    <w:nsid w:val="75E30857"/>
     <w:multiLevelType w:val="hybridMultilevel"/>
     <w:tmpl w:val="934E79A6"/>
     <w:lvl w:ilvl="0" w:tplc="04090001">
@@ -443,33 +445,6 @@
   </w:abstractNum>
   <w:num w:numId="1">
     <w:abstractNumId w:val="0"/>
-    <w:lvlOverride w:ilvl="0">
-      <w:startOverride w:val="1"/>
-    </w:lvlOverride>
-    <w:lvlOverride w:ilvl="1">
-      <w:startOverride w:val="1"/>
-    </w:lvlOverride>
-    <w:lvlOverride w:ilvl="2">
-      <w:startOverride w:val="1"/>
-    </w:lvlOverride>
-    <w:lvlOverride w:ilvl="3">
-      <w:startOverride w:val="1"/>
-    </w:lvlOverride>
-    <w:lvlOverride w:ilvl="4">
-      <w:startOverride w:val="1"/>
-    </w:lvlOverride>
-    <w:lvlOverride w:ilvl="5">
-      <w:startOverride w:val="1"/>
-    </w:lvlOverride>
-    <w:lvlOverride w:ilvl="6">
-      <w:startOverride w:val="1"/>
-    </w:lvlOverride>
-    <w:lvlOverride w:ilvl="7">
-      <w:startOverride w:val="1"/>
-    </w:lvlOverride>
-    <w:lvlOverride w:ilvl="8">
-      <w:startOverride w:val="1"/>
-    </w:lvlOverride>
   </w:num>
 </w:numbering>
 </file>
@@ -479,7 +454,8 @@
   <w:docDefaults>
     <w:rPrDefault>
       <w:rPr>
-        <w:rFonts w:asciiTheme="minorHAnsi" w:hAnsiTheme="minorHAnsi" w:eastAsiaTheme="minorHAnsi" w:cstheme="minorBidi"/>
+        <w:rFonts w:ascii="Aptos" w:hAnsi="Aptos" w:eastAsia="Aptos" w:cs="Aptos"/>
+        <w:color w:val="1B2433"/>
         <w:sz w:val="22"/>
         <w:szCs w:val="22"/>
         <w:lang w:val="en-US" w:eastAsia="en-US" w:bidi="ar-SA"/>
@@ -10412,18 +10388,19 @@
     <w:link w:val="Heading1Char"/>
     <w:uiPriority w:val="9"/>
     <w:qFormat/>
-    <w:rsid w:val="00973C6F"/>
     <w:pPr>
       <w:keepNext/>
       <w:keepLines/>
-      <w:spacing w:before="240" w:after="0"/>
+      <w:spacing w:before="360" w:after="120"/>
       <w:outlineLvl w:val="0"/>
     </w:pPr>
     <w:rPr>
-      <w:rFonts w:asciiTheme="majorHAnsi" w:hAnsiTheme="majorHAnsi" w:eastAsiaTheme="majorEastAsia" w:cstheme="majorBidi"/>
-      <w:color w:val="2F5496" w:themeColor="accent1" w:themeShade="BF"/>
-      <w:sz w:val="32"/>
-      <w:szCs w:val="32"/>
+      <w:rFonts w:asciiTheme="minorHAnsi" w:hAnsiTheme="minorHAnsi" w:eastAsiaTheme="minorEastAsia" w:cstheme="minorBidi"/>
+      <w:b/>
+      <w:bCs/>
+      <w:color w:val="1B2433"/>
+      <w:sz w:val="40"/>
+      <w:szCs w:val="40"/>
     </w:rPr>
   </w:style>
   <w:style w:type="paragraph" w:styleId="Heading2">
@@ -10433,19 +10410,19 @@
     <w:link w:val="Heading2Char"/>
     <w:uiPriority w:val="9"/>
     <w:unhideWhenUsed/>
-    <w:qFormat/>
-    <w:rsid w:val="00973C6F"/>
     <w:pPr>
       <w:keepNext/>
       <w:keepLines/>
-      <w:spacing w:before="40" w:after="0"/>
+      <w:spacing w:before="280" w:after="80"/>
       <w:outlineLvl w:val="1"/>
     </w:pPr>
     <w:rPr>
-      <w:rFonts w:asciiTheme="majorHAnsi" w:hAnsiTheme="majorHAnsi" w:eastAsiaTheme="majorEastAsia" w:cstheme="majorBidi"/>
-      <w:color w:val="2F5496" w:themeColor="accent1" w:themeShade="BF"/>
-      <w:sz w:val="26"/>
-      <w:szCs w:val="26"/>
+      <w:rFonts w:asciiTheme="minorHAnsi" w:hAnsiTheme="minorHAnsi" w:eastAsiaTheme="minorEastAsia" w:cstheme="minorBidi"/>
+      <w:b/>
+      <w:bCs/>
+      <w:color w:val="1B2433"/>
+      <w:sz w:val="30"/>
+      <w:szCs w:val="30"/>
     </w:rPr>
   </w:style>
   <w:style w:type="paragraph" w:styleId="Heading3">
@@ -10454,21 +10431,20 @@
     <w:next w:val="Normal"/>
     <w:link w:val="Heading3Char"/>
     <w:uiPriority w:val="9"/>
-    <w:semiHidden/>
     <w:unhideWhenUsed/>
-    <w:qFormat/>
-    <w:rsid w:val="00700ED2"/>
     <w:pPr>
       <w:keepNext/>
       <w:keepLines/>
-      <w:spacing w:before="40" w:after="0"/>
+      <w:spacing w:before="240" w:after="60"/>
       <w:outlineLvl w:val="2"/>
     </w:pPr>
     <w:rPr>
-      <w:rFonts w:asciiTheme="majorHAnsi" w:hAnsiTheme="majorHAnsi" w:eastAsiaTheme="majorEastAsia" w:cstheme="majorBidi"/>
-      <w:color w:val="1F3763" w:themeColor="accent1" w:themeShade="7F"/>
-      <w:sz w:val="24"/>
-      <w:szCs w:val="24"/>
+      <w:rFonts w:asciiTheme="minorHAnsi" w:hAnsiTheme="minorHAnsi" w:eastAsiaTheme="minorEastAsia" w:cstheme="minorBidi"/>
+      <w:b/>
+      <w:bCs/>
+      <w:color w:val="1B2433"/>
+      <w:sz w:val="25"/>
+      <w:szCs w:val="25"/>
     </w:rPr>
   </w:style>
   <w:style w:type="paragraph" w:styleId="Heading4">
@@ -10477,21 +10453,20 @@
     <w:next w:val="Normal"/>
     <w:link w:val="Heading4Char"/>
     <w:uiPriority w:val="9"/>
-    <w:semiHidden/>
     <w:unhideWhenUsed/>
-    <w:qFormat/>
-    <w:rsid w:val="00700ED2"/>
     <w:pPr>
       <w:keepNext/>
       <w:keepLines/>
-      <w:spacing w:before="40" w:after="0"/>
+      <w:spacing w:before="240" w:after="60"/>
       <w:outlineLvl w:val="3"/>
     </w:pPr>
     <w:rPr>
-      <w:rFonts w:asciiTheme="majorHAnsi" w:hAnsiTheme="majorHAnsi" w:eastAsiaTheme="majorEastAsia" w:cstheme="majorBidi"/>
-      <w:i/>
-      <w:iCs/>
-      <w:color w:val="2F5496" w:themeColor="accent1" w:themeShade="BF"/>
+      <w:rFonts w:asciiTheme="minorHAnsi" w:hAnsiTheme="minorHAnsi" w:eastAsiaTheme="minorEastAsia" w:cstheme="minorBidi"/>
+      <w:b/>
+      <w:bCs/>
+      <w:color w:val="1B2433"/>
+      <w:sz w:val="22"/>
+      <w:szCs w:val="22"/>
     </w:rPr>
   </w:style>
   <w:style w:type="paragraph" w:styleId="Heading5">
@@ -10500,19 +10475,20 @@
     <w:next w:val="Normal"/>
     <w:link w:val="Heading5Char"/>
     <w:uiPriority w:val="9"/>
-    <w:semiHidden/>
     <w:unhideWhenUsed/>
-    <w:qFormat/>
-    <w:rsid w:val="00700ED2"/>
     <w:pPr>
       <w:keepNext/>
       <w:keepLines/>
-      <w:spacing w:before="40" w:after="0"/>
+      <w:spacing w:before="240" w:after="60"/>
       <w:outlineLvl w:val="4"/>
     </w:pPr>
     <w:rPr>
-      <w:rFonts w:asciiTheme="majorHAnsi" w:hAnsiTheme="majorHAnsi" w:eastAsiaTheme="majorEastAsia" w:cstheme="majorBidi"/>
-      <w:color w:val="2F5496" w:themeColor="accent1" w:themeShade="BF"/>
+      <w:rFonts w:asciiTheme="minorHAnsi" w:hAnsiTheme="minorHAnsi" w:eastAsiaTheme="minorEastAsia" w:cstheme="minorBidi"/>
+      <w:b/>
+      <w:bCs/>
+      <w:color w:val="1B2433"/>
+      <w:sz w:val="22"/>
+      <w:szCs w:val="22"/>
     </w:rPr>
   </w:style>
   <w:style w:type="paragraph" w:styleId="Heading6">
@@ -10521,19 +10497,20 @@
     <w:next w:val="Normal"/>
     <w:link w:val="Heading6Char"/>
     <w:uiPriority w:val="9"/>
-    <w:semiHidden/>
     <w:unhideWhenUsed/>
-    <w:qFormat/>
-    <w:rsid w:val="00700ED2"/>
     <w:pPr>
       <w:keepNext/>
       <w:keepLines/>
-      <w:spacing w:before="40" w:after="0"/>
+      <w:spacing w:before="240" w:after="60"/>
       <w:outlineLvl w:val="5"/>
     </w:pPr>
     <w:rPr>
-      <w:rFonts w:asciiTheme="majorHAnsi" w:hAnsiTheme="majorHAnsi" w:eastAsiaTheme="majorEastAsia" w:cstheme="majorBidi"/>
-      <w:color w:val="1F3763" w:themeColor="accent1" w:themeShade="7F"/>
+      <w:rFonts w:asciiTheme="minorHAnsi" w:hAnsiTheme="minorHAnsi" w:eastAsiaTheme="minorEastAsia" w:cstheme="minorBidi"/>
+      <w:b/>
+      <w:bCs/>
+      <w:color w:val="1B2433"/>
+      <w:sz w:val="20"/>
+      <w:szCs w:val="20"/>
     </w:rPr>
   </w:style>
   <w:style w:type="paragraph" w:styleId="Heading7">
@@ -10618,6 +10595,43 @@
       <w:contextualSpacing/>
     </w:pPr>
   </w:style>
+  <w:style w:type="paragraph" w:styleId="Title">
+    <w:name w:val="Title"/>
+    <w:basedOn w:val="Normal"/>
+    <w:next w:val="Normal"/>
+    <w:uiPriority w:val="10"/>
+    <w:qFormat/>
+    <w:pPr>
+      <w:keepNext/>
+      <w:spacing w:before="0" w:after="120" w:line="240" w:lineRule="auto"/>
+      <w:contextualSpacing/>
+    </w:pPr>
+    <w:rPr>
+      <w:rFonts w:asciiTheme="minorHAnsi" w:hAnsiTheme="minorHAnsi" w:eastAsiaTheme="minorEastAsia" w:cstheme="minorBidi"/>
+      <w:b/>
+      <w:bCs/>
+      <w:color w:val="1B2433"/>
+      <w:kern w:val="28"/>
+      <w:sz w:val="56"/>
+      <w:szCs w:val="56"/>
+    </w:rPr>
+  </w:style>
+  <w:style w:type="paragraph" w:styleId="Subtitle">
+    <w:name w:val="Subtitle"/>
+    <w:basedOn w:val="Normal"/>
+    <w:next w:val="Normal"/>
+    <w:uiPriority w:val="11"/>
+    <w:qFormat/>
+    <w:pPr>
+      <w:keepNext/>
+      <w:spacing w:before="0" w:after="240"/>
+    </w:pPr>
+    <w:rPr>
+      <w:color w:val="3F64D7"/>
+      <w:sz w:val="25"/>
+      <w:szCs w:val="25"/>
+    </w:rPr>
+  </w:style>
   <w:style w:type="character" w:styleId="DefaultParagraphFont" w:default="true">
     <w:name w:val="Default Paragraph Font"/>
     <w:uiPriority w:val="1"/>
@@ -10629,12 +10643,15 @@
     <w:basedOn w:val="DefaultParagraphFont"/>
     <w:link w:val="Heading1"/>
     <w:uiPriority w:val="9"/>
-    <w:rsid w:val="00700ED2"/>
+    <w:semiHidden/>
+    <w:unhideWhenUsed/>
     <w:rPr>
-      <w:rFonts w:asciiTheme="majorHAnsi" w:hAnsiTheme="majorHAnsi" w:eastAsiaTheme="majorEastAsia" w:cstheme="majorBidi"/>
-      <w:color w:val="2F5496" w:themeColor="accent1" w:themeShade="BF"/>
-      <w:sz w:val="32"/>
-      <w:szCs w:val="32"/>
+      <w:rFonts w:asciiTheme="minorHAnsi" w:hAnsiTheme="minorHAnsi" w:eastAsiaTheme="minorEastAsia" w:cstheme="minorBidi"/>
+      <w:b/>
+      <w:bCs/>
+      <w:color w:val="1B2433"/>
+      <w:sz w:val="40"/>
+      <w:szCs w:val="40"/>
     </w:rPr>
   </w:style>
   <w:style w:type="character" w:styleId="Heading2Char" w:customStyle="true">
@@ -10643,12 +10660,14 @@
     <w:link w:val="Heading2"/>
     <w:uiPriority w:val="9"/>
     <w:semiHidden/>
-    <w:rsid w:val="00700ED2"/>
+    <w:unhideWhenUsed/>
     <w:rPr>
-      <w:rFonts w:asciiTheme="majorHAnsi" w:hAnsiTheme="majorHAnsi" w:eastAsiaTheme="majorEastAsia" w:cstheme="majorBidi"/>
-      <w:color w:val="2F5496" w:themeColor="accent1" w:themeShade="BF"/>
-      <w:sz w:val="26"/>
-      <w:szCs w:val="26"/>
+      <w:rFonts w:asciiTheme="minorHAnsi" w:hAnsiTheme="minorHAnsi" w:eastAsiaTheme="minorEastAsia" w:cstheme="minorBidi"/>
+      <w:b/>
+      <w:bCs/>
+      <w:color w:val="1B2433"/>
+      <w:sz w:val="30"/>
+      <w:szCs w:val="30"/>
     </w:rPr>
   </w:style>
   <w:style w:type="character" w:styleId="Heading3Char" w:customStyle="true">
@@ -10657,12 +10676,14 @@
     <w:link w:val="Heading3"/>
     <w:uiPriority w:val="9"/>
     <w:semiHidden/>
-    <w:rsid w:val="00700ED2"/>
+    <w:unhideWhenUsed/>
     <w:rPr>
-      <w:rFonts w:asciiTheme="majorHAnsi" w:hAnsiTheme="majorHAnsi" w:eastAsiaTheme="majorEastAsia" w:cstheme="majorBidi"/>
-      <w:color w:val="1F3763" w:themeColor="accent1" w:themeShade="7F"/>
-      <w:sz w:val="24"/>
-      <w:szCs w:val="24"/>
+      <w:rFonts w:asciiTheme="minorHAnsi" w:hAnsiTheme="minorHAnsi" w:eastAsiaTheme="minorEastAsia" w:cstheme="minorBidi"/>
+      <w:b/>
+      <w:bCs/>
+      <w:color w:val="1B2433"/>
+      <w:sz w:val="25"/>
+      <w:szCs w:val="25"/>
     </w:rPr>
   </w:style>
   <w:style w:type="character" w:styleId="Heading4Char" w:customStyle="true">
@@ -10671,12 +10692,14 @@
     <w:link w:val="Heading4"/>
     <w:uiPriority w:val="9"/>
     <w:semiHidden/>
-    <w:rsid w:val="00700ED2"/>
+    <w:unhideWhenUsed/>
     <w:rPr>
-      <w:rFonts w:asciiTheme="majorHAnsi" w:hAnsiTheme="majorHAnsi" w:eastAsiaTheme="majorEastAsia" w:cstheme="majorBidi"/>
-      <w:i/>
-      <w:iCs/>
-      <w:color w:val="2F5496" w:themeColor="accent1" w:themeShade="BF"/>
+      <w:rFonts w:asciiTheme="minorHAnsi" w:hAnsiTheme="minorHAnsi" w:eastAsiaTheme="minorEastAsia" w:cstheme="minorBidi"/>
+      <w:b/>
+      <w:bCs/>
+      <w:color w:val="1B2433"/>
+      <w:sz w:val="22"/>
+      <w:szCs w:val="22"/>
     </w:rPr>
   </w:style>
   <w:style w:type="character" w:styleId="Heading5Char" w:customStyle="true">
@@ -10685,10 +10708,14 @@
     <w:link w:val="Heading5"/>
     <w:uiPriority w:val="9"/>
     <w:semiHidden/>
-    <w:rsid w:val="00700ED2"/>
+    <w:unhideWhenUsed/>
     <w:rPr>
-      <w:rFonts w:asciiTheme="majorHAnsi" w:hAnsiTheme="majorHAnsi" w:eastAsiaTheme="majorEastAsia" w:cstheme="majorBidi"/>
-      <w:color w:val="2F5496" w:themeColor="accent1" w:themeShade="BF"/>
+      <w:rFonts w:asciiTheme="minorHAnsi" w:hAnsiTheme="minorHAnsi" w:eastAsiaTheme="minorEastAsia" w:cstheme="minorBidi"/>
+      <w:b/>
+      <w:bCs/>
+      <w:color w:val="1B2433"/>
+      <w:sz w:val="22"/>
+      <w:szCs w:val="22"/>
     </w:rPr>
   </w:style>
   <w:style w:type="character" w:styleId="Heading6Char" w:customStyle="true">
@@ -10697,10 +10724,14 @@
     <w:link w:val="Heading6"/>
     <w:uiPriority w:val="9"/>
     <w:semiHidden/>
-    <w:rsid w:val="00700ED2"/>
+    <w:unhideWhenUsed/>
     <w:rPr>
-      <w:rFonts w:asciiTheme="majorHAnsi" w:hAnsiTheme="majorHAnsi" w:eastAsiaTheme="majorEastAsia" w:cstheme="majorBidi"/>
-      <w:color w:val="1F3763" w:themeColor="accent1" w:themeShade="7F"/>
+      <w:rFonts w:asciiTheme="minorHAnsi" w:hAnsiTheme="minorHAnsi" w:eastAsiaTheme="minorEastAsia" w:cstheme="minorBidi"/>
+      <w:b/>
+      <w:bCs/>
+      <w:color w:val="1B2433"/>
+      <w:sz w:val="20"/>
+      <w:szCs w:val="20"/>
     </w:rPr>
   </w:style>
   <w:style w:type="character" w:styleId="Heading7Char" w:customStyle="true">
@@ -10875,55 +10906,252 @@
       <w:vertAlign w:val="superscript"/>
     </w:rPr>
   </w:style>
+  <w:style w:type="paragraph" w:styleId="TOCHeading">
+    <w:name w:val="TOC Heading"/>
+    <w:basedOn w:val="Heading1"/>
+    <w:next w:val="Normal"/>
+    <w:uiPriority w:val="39"/>
+    <w:unhideWhenUsed/>
+    <w:qFormat/>
+    <w:pPr>
+      <w:outlineLvl w:val="9"/>
+    </w:pPr>
+  </w:style>
+  <w:style w:type="paragraph" w:styleId="TOC1">
+    <w:name w:val="toc 1"/>
+    <w:basedOn w:val="Normal"/>
+    <w:next w:val="Normal"/>
+    <w:autoRedefine/>
+    <w:uiPriority w:val="39"/>
+    <w:unhideWhenUsed/>
+    <w:pPr>
+      <w:tabs>
+        <w:tab w:val="right" w:leader="dot" w:pos="9350"/>
+      </w:tabs>
+      <w:spacing w:after="100"/>
+    </w:pPr>
+  </w:style>
+  <w:style w:type="paragraph" w:styleId="TOC2">
+    <w:name w:val="toc 2"/>
+    <w:basedOn w:val="Normal"/>
+    <w:next w:val="Normal"/>
+    <w:autoRedefine/>
+    <w:uiPriority w:val="39"/>
+    <w:unhideWhenUsed/>
+    <w:pPr>
+      <w:tabs>
+        <w:tab w:val="right" w:leader="dot" w:pos="9350"/>
+      </w:tabs>
+      <w:spacing w:after="100"/>
+      <w:ind w:left="220"/>
+    </w:pPr>
+  </w:style>
+  <w:style w:type="paragraph" w:styleId="TOC3">
+    <w:name w:val="toc 3"/>
+    <w:basedOn w:val="Normal"/>
+    <w:next w:val="Normal"/>
+    <w:autoRedefine/>
+    <w:uiPriority w:val="39"/>
+    <w:unhideWhenUsed/>
+    <w:pPr>
+      <w:tabs>
+        <w:tab w:val="right" w:leader="dot" w:pos="9350"/>
+      </w:tabs>
+      <w:spacing w:after="100"/>
+      <w:ind w:left="440"/>
+    </w:pPr>
+  </w:style>
+  <w:style w:type="paragraph" w:styleId="TOC4">
+    <w:name w:val="toc 4"/>
+    <w:basedOn w:val="Normal"/>
+    <w:next w:val="Normal"/>
+    <w:autoRedefine/>
+    <w:uiPriority w:val="39"/>
+    <w:unhideWhenUsed/>
+    <w:pPr>
+      <w:tabs>
+        <w:tab w:val="right" w:leader="dot" w:pos="9350"/>
+      </w:tabs>
+      <w:spacing w:after="100"/>
+      <w:ind w:left="660"/>
+    </w:pPr>
+  </w:style>
+  <w:style w:type="paragraph" w:styleId="TOC5">
+    <w:name w:val="toc 5"/>
+    <w:basedOn w:val="Normal"/>
+    <w:next w:val="Normal"/>
+    <w:autoRedefine/>
+    <w:uiPriority w:val="39"/>
+    <w:unhideWhenUsed/>
+    <w:pPr>
+      <w:tabs>
+        <w:tab w:val="right" w:leader="dot" w:pos="9350"/>
+      </w:tabs>
+      <w:spacing w:after="100"/>
+      <w:ind w:left="880"/>
+    </w:pPr>
+  </w:style>
+  <w:style w:type="paragraph" w:styleId="TOC6">
+    <w:name w:val="toc 6"/>
+    <w:basedOn w:val="Normal"/>
+    <w:next w:val="Normal"/>
+    <w:autoRedefine/>
+    <w:uiPriority w:val="39"/>
+    <w:unhideWhenUsed/>
+    <w:pPr>
+      <w:tabs>
+        <w:tab w:val="right" w:leader="dot" w:pos="9350"/>
+      </w:tabs>
+      <w:spacing w:after="100"/>
+      <w:ind w:left="1100"/>
+    </w:pPr>
+  </w:style>
+  <w:style w:type="paragraph" w:styleId="TOC7">
+    <w:name w:val="toc 7"/>
+    <w:basedOn w:val="Normal"/>
+    <w:next w:val="Normal"/>
+    <w:autoRedefine/>
+    <w:uiPriority w:val="39"/>
+    <w:unhideWhenUsed/>
+    <w:pPr>
+      <w:tabs>
+        <w:tab w:val="right" w:leader="dot" w:pos="9350"/>
+      </w:tabs>
+      <w:spacing w:after="100"/>
+      <w:ind w:left="1320"/>
+    </w:pPr>
+  </w:style>
+  <w:style w:type="paragraph" w:styleId="TOC8">
+    <w:name w:val="toc 8"/>
+    <w:basedOn w:val="Normal"/>
+    <w:next w:val="Normal"/>
+    <w:autoRedefine/>
+    <w:uiPriority w:val="39"/>
+    <w:unhideWhenUsed/>
+    <w:pPr>
+      <w:tabs>
+        <w:tab w:val="right" w:leader="dot" w:pos="9350"/>
+      </w:tabs>
+      <w:spacing w:after="100"/>
+      <w:ind w:left="1540"/>
+    </w:pPr>
+  </w:style>
+  <w:style w:type="paragraph" w:styleId="TOC9">
+    <w:name w:val="toc 9"/>
+    <w:basedOn w:val="Normal"/>
+    <w:next w:val="Normal"/>
+    <w:autoRedefine/>
+    <w:uiPriority w:val="39"/>
+    <w:unhideWhenUsed/>
+    <w:pPr>
+      <w:tabs>
+        <w:tab w:val="right" w:leader="dot" w:pos="9350"/>
+      </w:tabs>
+      <w:spacing w:after="100"/>
+      <w:ind w:left="1760"/>
+    </w:pPr>
+  </w:style>
+  <w:style w:type="table" w:styleId="OfficeIMOModern">
+    <w:name w:val="OfficeIMO Modern"/>
+    <w:basedOn w:val="TableNormal"/>
+    <w:uiPriority w:val="40"/>
+    <w:pPr>
+      <w:spacing w:before="0" w:after="0" w:line="240" w:lineRule="auto"/>
+    </w:pPr>
+    <w:rPr>
+      <w:rFonts w:ascii="Aptos" w:hAnsi="Aptos" w:eastAsia="Aptos" w:cs="Aptos"/>
+      <w:color w:val="1B2433"/>
+      <w:sz w:val="20"/>
+      <w:szCs w:val="20"/>
+    </w:rPr>
+    <w:tblPr>
+      <w:tblStyleRowBandSize w:val="1"/>
+      <w:tblStyleColBandSize w:val="1"/>
+      <w:tblBorders>
+        <w:bottom w:val="single" w:color="DCE2EA" w:sz="4" w:space="0"/>
+        <w:insideH w:val="single" w:color="DCE2EA" w:sz="4" w:space="0"/>
+      </w:tblBorders>
+      <w:tblCellMar>
+        <w:top w:w="100" w:type="dxa"/>
+        <w:left w:w="140" w:type="dxa"/>
+        <w:bottom w:w="100" w:type="dxa"/>
+        <w:right w:w="140" w:type="dxa"/>
+      </w:tblCellMar>
+    </w:tblPr>
+    <w:tblStylePr w:type="firstRow">
+      <w:pPr>
+        <w:keepNext/>
+      </w:pPr>
+      <w:rPr>
+        <w:b w:val="true"/>
+        <w:bCs w:val="true"/>
+        <w:color w:val="1B2433"/>
+      </w:rPr>
+      <w:trPr>
+        <w:tblHeader/>
+      </w:trPr>
+      <w:tcPr>
+        <w:tcBorders>
+          <w:bottom w:val="single" w:color="3F64D7" w:sz="8" w:space="0"/>
+        </w:tcBorders>
+        <w:shd w:val="clear" w:color="auto" w:fill="EAF0FC"/>
+      </w:tcPr>
+    </w:tblStylePr>
+    <w:tblStylePr w:type="band2Horz">
+      <w:tcPr>
+        <w:shd w:val="clear" w:color="auto" w:fill="F6F8FB"/>
+      </w:tcPr>
+    </w:tblStylePr>
+  </w:style>
 </w:styles>
 </file>
 
 <file path=word/theme/theme1.xml><?xml version="1.0" encoding="utf-8"?>
-<a:theme xmlns:thm15="http://schemas.microsoft.com/office/thememl/2012/main" xmlns:a="http://schemas.openxmlformats.org/drawingml/2006/main" name="Office Theme">
+<a:theme xmlns:thm15="http://schemas.microsoft.com/office/thememl/2012/main" xmlns:a="http://schemas.openxmlformats.org/drawingml/2006/main" name="Modern">
   <a:themeElements>
-    <a:clrScheme name="Office">
+    <a:clrScheme name="Modern">
       <a:dk1>
-        <a:sysClr val="windowText" lastClr="000000"/>
+        <a:srgbClr val="1B2433"/>
       </a:dk1>
       <a:lt1>
-        <a:sysClr val="window" lastClr="FFFFFF"/>
+        <a:srgbClr val="FFFFFF"/>
       </a:lt1>
       <a:dk2>
-        <a:srgbClr val="44546A"/>
+        <a:srgbClr val="5B6575"/>
       </a:dk2>
       <a:lt2>
-        <a:srgbClr val="E7E6E6"/>
+        <a:srgbClr val="F6F8FB"/>
       </a:lt2>
       <a:accent1>
-        <a:srgbClr val="4472C4"/>
+        <a:srgbClr val="3F64D7"/>
       </a:accent1>
       <a:accent2>
-        <a:srgbClr val="ED7D31"/>
+        <a:srgbClr val="DC7536"/>
       </a:accent2>
       <a:accent3>
-        <a:srgbClr val="A5A5A5"/>
+        <a:srgbClr val="058E80"/>
       </a:accent3>
       <a:accent4>
-        <a:srgbClr val="FFC000"/>
+        <a:srgbClr val="A52758"/>
       </a:accent4>
       <a:accent5>
-        <a:srgbClr val="5B9BD5"/>
+        <a:srgbClr val="3F2F6B"/>
       </a:accent5>
       <a:accent6>
-        <a:srgbClr val="70AD47"/>
+        <a:srgbClr val="255319"/>
       </a:accent6>
       <a:hlink>
-        <a:srgbClr val="0563C1"/>
+        <a:srgbClr val="3F64D7"/>
       </a:hlink>
       <a:folHlink>
-        <a:srgbClr val="954F72"/>
+        <a:srgbClr val="DC7536"/>
       </a:folHlink>
     </a:clrScheme>
-    <a:fontScheme name="Office">
+    <a:fontScheme name="Modern">
       <a:majorFont>
-        <a:latin typeface="Calibri Light" panose="020F0302020204030204"/>
-        <a:ea typeface=""/>
-        <a:cs typeface=""/>
+        <a:latin typeface="Aptos"/>
+        <a:ea typeface="Aptos"/>
+        <a:cs typeface="Aptos"/>
         <a:font script="Jpan" typeface="游ゴシック Light"/>
         <a:font script="Hang" typeface="맑은 고딕"/>
         <a:font script="Hans" typeface="等线 Light"/>
@@ -10973,9 +11201,9 @@
         <a:font script="Tfng" typeface="Ebrima"/>
       </a:majorFont>
       <a:minorFont>
-        <a:latin typeface="Calibri" panose="020F0502020204030204"/>
-        <a:ea typeface=""/>
-        <a:cs typeface=""/>
+        <a:latin typeface="Aptos"/>
+        <a:ea typeface="Aptos"/>
+        <a:cs typeface="Aptos"/>
         <a:font script="Jpan" typeface="游明朝"/>
         <a:font script="Hang" typeface="맑은 고딕"/>
         <a:font script="Hans" typeface="等线"/>

</xml_diff>

<commit_message>
Regenerate integration downloads from the current PowerShell examples
</commit_message>
<xml_diff>
--- a/Website/static/downloads/integrations/events/EventIncidentBrief.docx
+++ b/Website/static/downloads/integrations/events/EventIncidentBrief.docx
@@ -250,8 +250,8 @@
       </w:r>
     </w:p>
     <w:sectPr>
-      <w:headerReference w:type="default" r:id="R2cf2818327594322"/>
-      <w:footerReference w:type="default" r:id="Ra01970b5c9f64920"/>
+      <w:headerReference w:type="default" r:id="R6d591577e2be43fc"/>
+      <w:footerReference w:type="default" r:id="Rbdea2d48fd2045ea"/>
       <w:pgSz w:w="12240" w:h="15840" w:code="1"/>
       <w:pgMar w:top="1440" w:right="1440" w:bottom="1440" w:left="1440" w:header="720" w:footer="720" w:gutter="0"/>
     </w:sectPr>
@@ -331,7 +331,7 @@
 <file path=word/numbering.xml><?xml version="1.0" encoding="utf-8"?>
 <w:numbering xmlns:wpc="http://schemas.microsoft.com/office/word/2010/wordprocessingCanvas" xmlns:cx="http://schemas.microsoft.com/office/drawing/2014/chartex" xmlns:cx1="http://schemas.microsoft.com/office/drawing/2015/9/8/chartex" xmlns:cx2="http://schemas.microsoft.com/office/drawing/2015/10/21/chartex" xmlns:cx3="http://schemas.microsoft.com/office/drawing/2016/5/9/chartex" xmlns:cx4="http://schemas.microsoft.com/office/drawing/2016/5/10/chartex" xmlns:cx5="http://schemas.microsoft.com/office/drawing/2016/5/11/chartex" xmlns:cx6="http://schemas.microsoft.com/office/drawing/2016/5/12/chartex" xmlns:cx7="http://schemas.microsoft.com/office/drawing/2016/5/13/chartex" xmlns:cx8="http://schemas.microsoft.com/office/drawing/2016/5/14/chartex" xmlns:mc="http://schemas.openxmlformats.org/markup-compatibility/2006" xmlns:aink="http://schemas.microsoft.com/office/drawing/2016/ink" xmlns:am3d="http://schemas.microsoft.com/office/drawing/2017/model3d" xmlns:o="urn:schemas-microsoft-com:office:office" xmlns:oel="http://schemas.microsoft.com/office/2019/extlst" xmlns:r="http://schemas.openxmlformats.org/officeDocument/2006/relationships" xmlns:m="http://schemas.openxmlformats.org/officeDocument/2006/math" xmlns:v="urn:schemas-microsoft-com:vml" xmlns:wp14="http://schemas.microsoft.com/office/word/2010/wordprocessingDrawing" xmlns:wp="http://schemas.openxmlformats.org/drawingml/2006/wordprocessingDrawing" xmlns:w10="urn:schemas-microsoft-com:office:word" xmlns:w="http://schemas.openxmlformats.org/wordprocessingml/2006/main" xmlns:w14="http://schemas.microsoft.com/office/word/2010/wordml" xmlns:w15="http://schemas.microsoft.com/office/word/2012/wordml" xmlns:w16cex="http://schemas.microsoft.com/office/word/2018/wordml/cex" xmlns:w16cid="http://schemas.microsoft.com/office/word/2016/wordml/cid" xmlns:w16="http://schemas.microsoft.com/office/word/2018/wordml" xmlns:w16sdtdh="http://schemas.microsoft.com/office/word/2020/wordml/sdtdatahash" xmlns:w16se="http://schemas.microsoft.com/office/word/2015/wordml/symex" xmlns:wpg="http://schemas.microsoft.com/office/word/2010/wordprocessingGroup" xmlns:wpi="http://schemas.microsoft.com/office/word/2010/wordprocessingInk" xmlns:wne="http://schemas.microsoft.com/office/word/2006/wordml" xmlns:wps="http://schemas.microsoft.com/office/word/2010/wordprocessingShape" mc:Ignorable="w14 w15 w16se w16cid w16 w16cex w16sdtdh wp14">
   <w:abstractNum w:abstractNumId="0" w15:restartNumberingAfterBreak="0">
-    <w:nsid w:val="75E30857"/>
+    <w:nsid w:val="B7735D9C"/>
     <w:multiLevelType w:val="hybridMultilevel"/>
     <w:tmpl w:val="934E79A6"/>
     <w:lvl w:ilvl="0" w:tplc="04090001">

</xml_diff>